<commit_message>
feat: lock the 7-day kit to owning a car
Rewrite the deck, journal, and tracker around one desire: kendi arabam. Adds a ready 369 line, a driving SATS scene, and daily real-world car steps (budget, listings, insurance, deposit).

Co-authored-by: iremalisan <iremalisan@users.noreply.github.com>
</commit_message>
<xml_diff>
--- a/rehber/Yedi_Gunluk_Manifest_Defteri.docx
+++ b/rehber/Yedi_Gunluk_Manifest_Defteri.docx
@@ -15,7 +15,7 @@
           <w:color w:val="C99A4A"/>
           <w:sz w:val="22"/>
         </w:rPr>
-        <w:t>7 GÜNLÜK HIZLI MANIFEST DEFTERİ</w:t>
+        <w:t>KENDİ ARABAM İÇİN 7 GÜNLÜK MANIFEST DEFTERİ</w:t>
       </w:r>
     </w:p>
     <w:p>
@@ -29,9 +29,9 @@
           <w:b/>
           <w:i w:val="0"/>
           <w:color w:val="2A163A"/>
-          <w:sz w:val="56"/>
+          <w:sz w:val="52"/>
         </w:rPr>
-        <w:t>Yaz, hisset, bir adım at.</w:t>
+        <w:t>Anahtarı çevir. Bir adım at.</w:t>
       </w:r>
     </w:p>
     <w:p>
@@ -47,7 +47,7 @@
           <w:color w:val="6E6076"/>
           <w:sz w:val="24"/>
         </w:rPr>
-        <w:t>Bu defter izlenecek 12 slaytlık rehberin uygulama yüzüdür. Her gün aynı iskelet: sabah 3, öğlen 6, gece 9 yazış + SATS + 1 somut adım. Yeni teknik ekleme. Mükemmel cümle arama.</w:t>
+        <w:t>Tek istek: kendi arabam. Her gün aynı iskelet: sabah 3, öğlen 6, gece 9 yazış + direksiyon SATS + 1 araba adımı. Yeni teknik ekleme. 20 model karıştırma.</w:t>
       </w:r>
     </w:p>
     <w:tbl>
@@ -74,7 +74,7 @@
                 <w:color w:val="2A163A"/>
                 <w:sz w:val="26"/>
               </w:rPr>
-              <w:t>Kural: 7 gün boyunca tek istek.</w:t>
+              <w:t>Kural: 7 gün boyunca tek istek — kendi arabam.</w:t>
             </w:r>
           </w:p>
         </w:tc>
@@ -95,7 +95,7 @@
                 <w:color w:val="2A163A"/>
                 <w:sz w:val="26"/>
               </w:rPr>
-              <w:t>Kural: Cümle şimdiki zamanda, 25 kelimeyi geçmesin.</w:t>
+              <w:t>Kural: Cümle şimdiki zamanda. En fazla 3 model adayı.</w:t>
             </w:r>
           </w:p>
         </w:tc>
@@ -116,7 +116,7 @@
                 <w:color w:val="2A163A"/>
                 <w:sz w:val="26"/>
               </w:rPr>
-              <w:t>Kural: Kanıt avı yok. Defteri kapat, güne dön.</w:t>
+              <w:t>Kural: İlan avı yok. Defteri kapat, 1 gerçek adım at.</w:t>
             </w:r>
           </w:p>
         </w:tc>
@@ -163,7 +163,7 @@
           <w:color w:val="2A163A"/>
           <w:sz w:val="44"/>
         </w:rPr>
-        <w:t>İstek kilidi</w:t>
+        <w:t>İstek kilidi — kendi arabam</w:t>
       </w:r>
     </w:p>
     <w:p>
@@ -183,6 +183,21 @@
     </w:p>
     <w:p>
       <w:pPr>
+        <w:spacing w:after="120" w:before="0"/>
+      </w:pPr>
+      <w:r>
+        <w:rPr>
+          <w:rFonts w:ascii="Calibri" w:hAnsi="Calibri" w:eastAsia="Calibri"/>
+          <w:b w:val="0"/>
+          <w:i/>
+          <w:color w:val="6E6076"/>
+          <w:sz w:val="24"/>
+        </w:rPr>
+        <w:t>Kendi arabam. (Markayı 3 adaya indirmeden büyütme.)</w:t>
+      </w:r>
+    </w:p>
+    <w:p>
+      <w:pPr>
         <w:spacing w:after="200"/>
       </w:pPr>
       <w:r>
@@ -198,6 +213,66 @@
     </w:p>
     <w:p>
       <w:pPr>
+        <w:spacing w:after="160" w:before="0"/>
+      </w:pPr>
+      <w:r>
+        <w:rPr>
+          <w:rFonts w:ascii="Calibri" w:hAnsi="Calibri" w:eastAsia="Calibri"/>
+          <w:b/>
+          <w:i w:val="0"/>
+          <w:color w:val="2A163A"/>
+          <w:sz w:val="24"/>
+        </w:rPr>
+        <w:t>369 cümlem (her gün 3 + 6 + 9 kez elle yaz):</w:t>
+      </w:r>
+    </w:p>
+    <w:p>
+      <w:pPr>
+        <w:spacing w:after="160" w:before="0"/>
+      </w:pPr>
+      <w:r>
+        <w:rPr>
+          <w:rFonts w:ascii="Calibri" w:hAnsi="Calibri" w:eastAsia="Calibri"/>
+          <w:b/>
+          <w:i w:val="0"/>
+          <w:color w:val="C45476"/>
+          <w:sz w:val="26"/>
+        </w:rPr>
+        <w:t>Çok minnettarım, kendi arabamla yola çıkıyorum ve özgür hissediyorum.</w:t>
+      </w:r>
+    </w:p>
+    <w:p>
+      <w:pPr>
+        <w:spacing w:after="200" w:before="0"/>
+      </w:pPr>
+      <w:r>
+        <w:rPr>
+          <w:rFonts w:ascii="Calibri" w:hAnsi="Calibri" w:eastAsia="Calibri"/>
+          <w:b w:val="0"/>
+          <w:i/>
+          <w:color w:val="6E6076"/>
+          <w:sz w:val="22"/>
+        </w:rPr>
+        <w:t>Yedek cümle (daha somut istersen): Kendi arabamın anahtarı çantamda; her yere rahatça gidiyorum.</w:t>
+      </w:r>
+    </w:p>
+    <w:p>
+      <w:pPr>
+        <w:spacing w:after="160" w:before="0"/>
+      </w:pPr>
+      <w:r>
+        <w:rPr>
+          <w:rFonts w:ascii="Calibri" w:hAnsi="Calibri" w:eastAsia="Calibri"/>
+          <w:b/>
+          <w:i w:val="0"/>
+          <w:color w:val="2A163A"/>
+          <w:sz w:val="24"/>
+        </w:rPr>
+        <w:t>Bütçe aralığım (alt – üst) ve 2. el / yeni:</w:t>
+      </w:r>
+    </w:p>
+    <w:p>
+      <w:pPr>
         <w:spacing w:after="200"/>
       </w:pPr>
       <w:r>
@@ -213,21 +288,6 @@
     </w:p>
     <w:p>
       <w:pPr>
-        <w:spacing w:after="160" w:before="0"/>
-      </w:pPr>
-      <w:r>
-        <w:rPr>
-          <w:rFonts w:ascii="Calibri" w:hAnsi="Calibri" w:eastAsia="Calibri"/>
-          <w:b/>
-          <w:i w:val="0"/>
-          <w:color w:val="2A163A"/>
-          <w:sz w:val="24"/>
-        </w:rPr>
-        <w:t>369 cümlem (şimdiki zaman, minnettarlık + duygu):</w:t>
-      </w:r>
-    </w:p>
-    <w:p>
-      <w:pPr>
         <w:spacing w:after="200"/>
       </w:pPr>
       <w:r>
@@ -243,36 +303,6 @@
     </w:p>
     <w:p>
       <w:pPr>
-        <w:spacing w:after="200"/>
-      </w:pPr>
-      <w:r>
-        <w:rPr>
-          <w:rFonts w:ascii="Calibri" w:hAnsi="Calibri" w:eastAsia="Calibri"/>
-          <w:b w:val="0"/>
-          <w:i w:val="0"/>
-          <w:color w:val="C8BCC4"/>
-          <w:sz w:val="24"/>
-        </w:rPr>
-        <w:t>________________________________________________________________</w:t>
-      </w:r>
-    </w:p>
-    <w:p>
-      <w:pPr>
-        <w:spacing w:after="200"/>
-      </w:pPr>
-      <w:r>
-        <w:rPr>
-          <w:rFonts w:ascii="Calibri" w:hAnsi="Calibri" w:eastAsia="Calibri"/>
-          <w:b w:val="0"/>
-          <w:i w:val="0"/>
-          <w:color w:val="C8BCC4"/>
-          <w:sz w:val="24"/>
-        </w:rPr>
-        <w:t>________________________________________________________________</w:t>
-      </w:r>
-    </w:p>
-    <w:p>
-      <w:pPr>
         <w:spacing w:after="160" w:before="0"/>
       </w:pPr>
       <w:r>
@@ -283,7 +313,7 @@
           <w:color w:val="2A163A"/>
           <w:sz w:val="24"/>
         </w:rPr>
-        <w:t>Bunu 90 günde mümkün kılan en küçük gerçek işaret:</w:t>
+        <w:t>En fazla 3 model adayı:</w:t>
       </w:r>
     </w:p>
     <w:p>
@@ -348,7 +378,7 @@
           <w:color w:val="2A163A"/>
           <w:sz w:val="44"/>
         </w:rPr>
-        <w:t>SATS sahnesi</w:t>
+        <w:t>SATS sahnesi — anahtarı çevir</w:t>
       </w:r>
     </w:p>
     <w:p>
@@ -363,7 +393,7 @@
           <w:color w:val="6E6076"/>
           <w:sz w:val="24"/>
         </w:rPr>
-        <w:t>Sahne, dileğin gerçekleşmesinden SONRA olmalıdır. 5–10 saniye, birinci tekil şahıs, GIF gibi döngü.</w:t>
+        <w:t>Sahne, arabaya bindikten SONRA olmalıdır. 5–10 saniye, birinci tekil şahıs, GIF gibi döngü. Uyuyakalmak başarıdır.</w:t>
       </w:r>
     </w:p>
     <w:p>
@@ -378,7 +408,7 @@
           <w:color w:val="2A163A"/>
           <w:sz w:val="24"/>
         </w:rPr>
-        <w:t>Neredeyim, saat kaç?</w:t>
+        <w:t>Hazır sahne: Evin önünde kendi arabam park halinde. Çantamdan anahtarı alıyorum, kapıyı açıyorum, koltuğa oturuyorum, anahtarı çeviriyorum, kemer klik, ‘geldik’.</w:t>
       </w:r>
     </w:p>
     <w:p>
@@ -423,7 +453,7 @@
           <w:color w:val="2A163A"/>
           <w:sz w:val="24"/>
         </w:rPr>
-        <w:t>Kiminle / hangi cümleyi duyuyorum?</w:t>
+        <w:t>Neredeyim, saat kaç? (ör. salı 08:40, evin önü)</w:t>
       </w:r>
     </w:p>
     <w:p>
@@ -468,7 +498,7 @@
           <w:color w:val="2A163A"/>
           <w:sz w:val="24"/>
         </w:rPr>
-        <w:t>Elimde, yüzümde, odada ne var? (3 duyu)</w:t>
+        <w:t>Elimde / kulağımda / burnumda ne var? (anahtarlık, motor sesi, kumaş kokusu)</w:t>
       </w:r>
     </w:p>
     <w:p>
@@ -513,7 +543,7 @@
           <w:color w:val="2A163A"/>
           <w:sz w:val="24"/>
         </w:rPr>
-        <w:t>Vücutta hangi ‘tabii ki böyle’ hissi var?</w:t>
+        <w:t>Vücutta hangi ‘tabii ki benim arabam’ hissi var?</w:t>
       </w:r>
     </w:p>
     <w:p>
@@ -608,7 +638,7 @@
           <w:color w:val="6E6076"/>
           <w:sz w:val="22"/>
         </w:rPr>
-        <w:t>Tek dilek, 369 cümlesiyle aynı.</w:t>
+        <w:t>Kendi arabam. 369 cümlesiyle aynı.</w:t>
       </w:r>
     </w:p>
     <w:p>
@@ -683,7 +713,7 @@
           <w:color w:val="6E6076"/>
           <w:sz w:val="22"/>
         </w:rPr>
-        <w:t>Olduğunda en güzel 30 saniye.</w:t>
+        <w:t>Kapıyı açıp koltuğa oturduğun an. Kemer klik. Geldik.</w:t>
       </w:r>
     </w:p>
     <w:p>
@@ -758,7 +788,7 @@
           <w:color w:val="6E6076"/>
           <w:sz w:val="22"/>
         </w:rPr>
-        <w:t>Dış dünya değil: içindeki asıl fren.</w:t>
+        <w:t>Dış fiyat değil: ‘param yetmez’ kaydırması, ilan bakıp hiç aramamak.</w:t>
       </w:r>
     </w:p>
     <w:p>
@@ -833,7 +863,7 @@
           <w:color w:val="6E6076"/>
           <w:sz w:val="22"/>
         </w:rPr>
-        <w:t>Eğer [engel], o zaman [2 dakikalık davranış].</w:t>
+        <w:t>Eğer ‘alamam’ dersem, o zaman 2 dk biriktirme notu veya 1 satıcı mesajı.</w:t>
       </w:r>
     </w:p>
     <w:p>
@@ -928,7 +958,7 @@
           <w:color w:val="6E6076"/>
           <w:sz w:val="24"/>
         </w:rPr>
-        <w:t>Bugün tek isteği kilitle. İlk somut adımı bugün at.</w:t>
+        <w:t>Bugün: bütçe alt–üst + 2. el/yeni + en fazla 3 model.</w:t>
       </w:r>
     </w:p>
     <w:tbl>
@@ -1116,7 +1146,7 @@
           <w:color w:val="2A163A"/>
           <w:sz w:val="24"/>
         </w:rPr>
-        <w:t>Bugünün tek somut adımı (10 dakikayı geçmesin):</w:t>
+        <w:t>Bugünün tek araba adımı (10 dakikayı geçmesin):</w:t>
       </w:r>
     </w:p>
     <w:p>
@@ -1331,7 +1361,7 @@
           <w:color w:val="6E6076"/>
           <w:sz w:val="24"/>
         </w:rPr>
-        <w:t>Aynı cümle. En küçük görünür hareket yeter.</w:t>
+        <w:t>Bugün: ehliyet kontrolü, kasko/trafik kaba fiyat, biriktirme yeri.</w:t>
       </w:r>
     </w:p>
     <w:tbl>
@@ -1519,7 +1549,7 @@
           <w:color w:val="2A163A"/>
           <w:sz w:val="24"/>
         </w:rPr>
-        <w:t>Bugünün tek somut adımı (10 dakikayı geçmesin):</w:t>
+        <w:t>Bugünün tek araba adımı (10 dakikayı geçmesin):</w:t>
       </w:r>
     </w:p>
     <w:p>
@@ -1734,7 +1764,7 @@
           <w:color w:val="6E6076"/>
           <w:sz w:val="24"/>
         </w:rPr>
-        <w:t>8 dakikalık scripting yaz. Bir kapı çal.</w:t>
+        <w:t>Bugün: 8 dk araba scripting + 5 ilan kaydet, 2’sine yaz.</w:t>
       </w:r>
     </w:p>
     <w:tbl>
@@ -1922,7 +1952,7 @@
           <w:color w:val="2A163A"/>
           <w:sz w:val="24"/>
         </w:rPr>
-        <w:t>Bugünün tek somut adımı (10 dakikayı geçmesin):</w:t>
+        <w:t>Bugünün tek araba adımı (10 dakikayı geçmesin):</w:t>
       </w:r>
     </w:p>
     <w:p>
@@ -2102,7 +2132,22 @@
           <w:color w:val="C45476"/>
           <w:sz w:val="24"/>
         </w:rPr>
-        <w:t>Scripting (olmuş bir salı sabahı, 8 dakika):</w:t>
+        <w:t>Scripting (salı sabahı kendi araban, 8 dakika):</w:t>
+      </w:r>
+    </w:p>
+    <w:p>
+      <w:pPr>
+        <w:spacing w:after="120" w:before="0"/>
+      </w:pPr>
+      <w:r>
+        <w:rPr>
+          <w:rFonts w:ascii="Calibri" w:hAnsi="Calibri" w:eastAsia="Calibri"/>
+          <w:b w:val="0"/>
+          <w:i/>
+          <w:color w:val="6E6076"/>
+          <w:sz w:val="22"/>
+        </w:rPr>
+        <w:t>Kapıyı açıyorum… koltuk… anahtar… motor… evin önünden çıkıyorum…</w:t>
       </w:r>
     </w:p>
     <w:p>
@@ -2272,7 +2317,7 @@
           <w:color w:val="6E6076"/>
           <w:sz w:val="24"/>
         </w:rPr>
-        <w:t>İç freni adlandır. WOOP planını sıkılaştır.</w:t>
+        <w:t>Bugün: ‘param yetmez’i yaz. İlk küçük transferi yap.</w:t>
       </w:r>
     </w:p>
     <w:tbl>
@@ -2460,7 +2505,7 @@
           <w:color w:val="2A163A"/>
           <w:sz w:val="24"/>
         </w:rPr>
-        <w:t>Bugünün tek somut adımı (10 dakikayı geçmesin):</w:t>
+        <w:t>Bugünün tek araba adımı (10 dakikayı geçmesin):</w:t>
       </w:r>
     </w:p>
     <w:p>
@@ -2675,7 +2720,7 @@
           <w:color w:val="6E6076"/>
           <w:sz w:val="24"/>
         </w:rPr>
-        <w:t>Günü bunu zaten yaşayan kişi olarak geçir.</w:t>
+        <w:t>Bugün: galeride benzer arabaya otur veya park yerinden geç.</w:t>
       </w:r>
     </w:p>
     <w:tbl>
@@ -2863,7 +2908,7 @@
           <w:color w:val="2A163A"/>
           <w:sz w:val="24"/>
         </w:rPr>
-        <w:t>Bugünün tek somut adımı (10 dakikayı geçmesin):</w:t>
+        <w:t>Bugünün tek araba adımı (10 dakikayı geçmesin):</w:t>
       </w:r>
     </w:p>
     <w:p>
@@ -3078,7 +3123,7 @@
           <w:color w:val="6E6076"/>
           <w:sz w:val="24"/>
         </w:rPr>
-        <w:t>3 küçük işaret + 1 büyükçe adım.</w:t>
+        <w:t>Bugün: 1 satıcı/galeri ara. 1 fiyat veya ekspertiz sor.</w:t>
       </w:r>
     </w:p>
     <w:tbl>
@@ -3266,7 +3311,7 @@
           <w:color w:val="2A163A"/>
           <w:sz w:val="24"/>
         </w:rPr>
-        <w:t>Bugünün tek somut adımı (10 dakikayı geçmesin):</w:t>
+        <w:t>Bugünün tek araba adımı (10 dakikayı geçmesin):</w:t>
       </w:r>
     </w:p>
     <w:p>
@@ -3481,7 +3526,7 @@
           <w:color w:val="6E6076"/>
           <w:sz w:val="24"/>
         </w:rPr>
-        <w:t>Cümleyi %10 netleştir. 21 güne kilit at.</w:t>
+        <w:t>Bugün: 3 adayı 1–2’ye indir. 21 günlük bakış + biriktirme kilidi.</w:t>
       </w:r>
     </w:p>
     <w:tbl>
@@ -3669,7 +3714,7 @@
           <w:color w:val="2A163A"/>
           <w:sz w:val="24"/>
         </w:rPr>
-        <w:t>Bugünün tek somut adımı (10 dakikayı geçmesin):</w:t>
+        <w:t>Bugünün tek araba adımı (10 dakikayı geçmesin):</w:t>
       </w:r>
     </w:p>
     <w:p>
@@ -3849,7 +3894,7 @@
           <w:color w:val="C45476"/>
           <w:sz w:val="24"/>
         </w:rPr>
-        <w:t>7 günün özeti ve önümüzdeki 21 güne kilit cümle:</w:t>
+        <w:t>7 günün özeti + 21 güne kilit (her hafta 1 bakış + 1 biriktirme):</w:t>
       </w:r>
     </w:p>
     <w:p>
@@ -3969,7 +4014,7 @@
           <w:color w:val="2A163A"/>
           <w:sz w:val="24"/>
         </w:rPr>
-        <w:t>Kapanış: Bir istek. Aynı cümle. Aynı sahne. Her gün bir adım. 7 günden sonra yeni teknik arama.</w:t>
+        <w:t>Kapanış: Kendi arabam. Aynı cümle. Anahtarı çevir. Her gün 1 adım.</w:t>
       </w:r>
     </w:p>
     <w:p>

</xml_diff>